<commit_message>
Refresh Baltimore project writeup
</commit_message>
<xml_diff>
--- a/projects/baltimore/documents/eura-baltimore-project-writeup.docx
+++ b/projects/baltimore/documents/eura-baltimore-project-writeup.docx
@@ -117,7 +117,7 @@
           <w:kern w:val="0"/>
           <w14:ligatures w14:val="none"/>
         </w:rPr>
-        <w:t xml:space="preserve">Back in 2024, my sophomore year at UMass, an esteemed Economics professor agreed to let me assist him in his research endeavors. He was working on a massive social network analysis project which had led him to amass an enormous amount of Social Register books which he </w:t>
+        <w:t xml:space="preserve">Back in 2024, my sophomore year at </w:t>
       </w:r>
       <w:r>
         <w:rPr>
@@ -126,6 +126,42 @@
           <w:kern w:val="0"/>
           <w14:ligatures w14:val="none"/>
         </w:rPr>
+        <w:t>UMass I had the privilege of being an Economics research assistant</w:t>
+      </w:r>
+      <w:r>
+        <w:rPr>
+          <w:rFonts w:ascii="Times New Roman" w:eastAsia="Times New Roman" w:hAnsi="Times New Roman" w:cs="Times New Roman"/>
+          <w:color w:val="000000"/>
+          <w:kern w:val="0"/>
+          <w14:ligatures w14:val="none"/>
+        </w:rPr>
+        <w:t xml:space="preserve">. </w:t>
+      </w:r>
+      <w:r>
+        <w:rPr>
+          <w:rFonts w:ascii="Times New Roman" w:eastAsia="Times New Roman" w:hAnsi="Times New Roman" w:cs="Times New Roman"/>
+          <w:color w:val="000000"/>
+          <w:kern w:val="0"/>
+          <w14:ligatures w14:val="none"/>
+        </w:rPr>
+        <w:t>The professor</w:t>
+      </w:r>
+      <w:r>
+        <w:rPr>
+          <w:rFonts w:ascii="Times New Roman" w:eastAsia="Times New Roman" w:hAnsi="Times New Roman" w:cs="Times New Roman"/>
+          <w:color w:val="000000"/>
+          <w:kern w:val="0"/>
+          <w14:ligatures w14:val="none"/>
+        </w:rPr>
+        <w:t xml:space="preserve"> was working on a social network analysis project which had led him to amass Social Register books which he </w:t>
+      </w:r>
+      <w:r>
+        <w:rPr>
+          <w:rFonts w:ascii="Times New Roman" w:eastAsia="Times New Roman" w:hAnsi="Times New Roman" w:cs="Times New Roman"/>
+          <w:color w:val="000000"/>
+          <w:kern w:val="0"/>
+          <w14:ligatures w14:val="none"/>
+        </w:rPr>
         <w:t>was aiming to</w:t>
       </w:r>
       <w:r>
@@ -200,7 +236,7 @@
           <w:kern w:val="0"/>
           <w14:ligatures w14:val="none"/>
         </w:rPr>
-        <w:t xml:space="preserve">The work itself was taking a picture of each individual page of a given book from front to back. As you might imagine, this was </w:t>
+        <w:t xml:space="preserve">The work itself was taking a picture of each individual page of a given book from front to back. </w:t>
       </w:r>
       <w:r>
         <w:rPr>
@@ -209,7 +245,7 @@
           <w:kern w:val="0"/>
           <w14:ligatures w14:val="none"/>
         </w:rPr>
-        <w:t>a</w:t>
+        <w:t>I</w:t>
       </w:r>
       <w:r>
         <w:rPr>
@@ -218,25 +254,7 @@
           <w:kern w:val="0"/>
           <w14:ligatures w14:val="none"/>
         </w:rPr>
-        <w:t xml:space="preserve"> mind-numbing </w:t>
-      </w:r>
-      <w:r>
-        <w:rPr>
-          <w:rFonts w:ascii="Times New Roman" w:eastAsia="Times New Roman" w:hAnsi="Times New Roman" w:cs="Times New Roman"/>
-          <w:color w:val="000000"/>
-          <w:kern w:val="0"/>
-          <w14:ligatures w14:val="none"/>
-        </w:rPr>
-        <w:t>task,</w:t>
-      </w:r>
-      <w:r>
-        <w:rPr>
-          <w:rFonts w:ascii="Times New Roman" w:eastAsia="Times New Roman" w:hAnsi="Times New Roman" w:cs="Times New Roman"/>
-          <w:color w:val="000000"/>
-          <w:kern w:val="0"/>
-          <w14:ligatures w14:val="none"/>
-        </w:rPr>
-        <w:t xml:space="preserve"> and it took roughly 1-2 hours a day for two and a half months to complete scanning all 10 or so of my books. </w:t>
+        <w:t>t took roughly 1-2 hours a day for two and a half months to complete scanning all 10 or so of my books</w:t>
       </w:r>
       <w:r>
         <w:rPr>
@@ -1350,7 +1368,7 @@
           <w:kern w:val="0"/>
         </w:rPr>
         <w:drawing>
-          <wp:inline distT="0" distB="0" distL="0" distR="0" wp14:anchorId="04A54450" wp14:editId="57FF4815">
+          <wp:inline distT="0" distB="0" distL="0" distR="0" wp14:anchorId="04A54450" wp14:editId="017D9C20">
             <wp:extent cx="5943600" cy="3437890"/>
             <wp:effectExtent l="0" t="0" r="0" b="3810"/>
             <wp:docPr id="717674590" name="Picture 11"/>
@@ -1488,7 +1506,7 @@
           <w:noProof/>
         </w:rPr>
         <w:drawing>
-          <wp:inline distT="0" distB="0" distL="0" distR="0" wp14:anchorId="61BAC7C7" wp14:editId="29811494">
+          <wp:inline distT="0" distB="0" distL="0" distR="0" wp14:anchorId="61BAC7C7" wp14:editId="01B114F5">
             <wp:extent cx="5781675" cy="3344231"/>
             <wp:effectExtent l="0" t="0" r="0" b="0"/>
             <wp:docPr id="1734982112" name="Picture 12"/>

</xml_diff>

<commit_message>
Unify research project layouts and publish native write-ups
</commit_message>
<xml_diff>
--- a/projects/baltimore/documents/eura-baltimore-project-writeup.docx
+++ b/projects/baltimore/documents/eura-baltimore-project-writeup.docx
@@ -153,7 +153,25 @@
           <w:kern w:val="0"/>
           <w14:ligatures w14:val="none"/>
         </w:rPr>
-        <w:t xml:space="preserve"> was working on a social network analysis project which had led him to amass Social Register books which he </w:t>
+        <w:t xml:space="preserve"> was working on a social network analysis project which had led him to amass Social Register books </w:t>
+      </w:r>
+      <w:r>
+        <w:rPr>
+          <w:rFonts w:ascii="Times New Roman" w:eastAsia="Times New Roman" w:hAnsi="Times New Roman" w:cs="Times New Roman"/>
+          <w:color w:val="000000"/>
+          <w:kern w:val="0"/>
+          <w14:ligatures w14:val="none"/>
+        </w:rPr>
+        <w:t>that</w:t>
+      </w:r>
+      <w:r>
+        <w:rPr>
+          <w:rFonts w:ascii="Times New Roman" w:eastAsia="Times New Roman" w:hAnsi="Times New Roman" w:cs="Times New Roman"/>
+          <w:color w:val="000000"/>
+          <w:kern w:val="0"/>
+          <w14:ligatures w14:val="none"/>
+        </w:rPr>
+        <w:t xml:space="preserve"> he </w:t>
       </w:r>
       <w:r>
         <w:rPr>
@@ -930,14 +948,15 @@
       </w:pPr>
       <w:r>
         <w:rPr>
-          <w:rFonts w:ascii="Times New Roman" w:hAnsi="Times New Roman" w:cs="Times New Roman"/>
+          <w:rFonts w:ascii="Times New Roman" w:eastAsia="Times New Roman" w:hAnsi="Times New Roman" w:cs="Times New Roman"/>
           <w:noProof/>
+          <w:kern w:val="0"/>
         </w:rPr>
         <w:drawing>
-          <wp:inline distT="0" distB="0" distL="0" distR="0" wp14:anchorId="35A63AD6" wp14:editId="57E19361">
-            <wp:extent cx="5402179" cy="3601453"/>
-            <wp:effectExtent l="0" t="0" r="0" b="5715"/>
-            <wp:docPr id="974002772" name="Picture 7"/>
+          <wp:inline distT="0" distB="0" distL="0" distR="0" wp14:anchorId="49E0D1CD" wp14:editId="6BB5F271">
+            <wp:extent cx="4769168" cy="3815715"/>
+            <wp:effectExtent l="0" t="0" r="6350" b="0"/>
+            <wp:docPr id="1379790509" name="Picture 1"/>
             <wp:cNvGraphicFramePr>
               <a:graphicFrameLocks xmlns:a="http://schemas.openxmlformats.org/drawingml/2006/main" noChangeAspect="1"/>
             </wp:cNvGraphicFramePr>
@@ -945,7 +964,7 @@
               <a:graphicData uri="http://schemas.openxmlformats.org/drawingml/2006/picture">
                 <pic:pic xmlns:pic="http://schemas.openxmlformats.org/drawingml/2006/picture">
                   <pic:nvPicPr>
-                    <pic:cNvPr id="974002772" name="Picture 974002772"/>
+                    <pic:cNvPr id="1379790509" name="Picture 1379790509"/>
                     <pic:cNvPicPr/>
                   </pic:nvPicPr>
                   <pic:blipFill>
@@ -963,7 +982,7 @@
                   <pic:spPr>
                     <a:xfrm>
                       <a:off x="0" y="0"/>
-                      <a:ext cx="5467250" cy="3644833"/>
+                      <a:ext cx="4816911" cy="3853913"/>
                     </a:xfrm>
                     <a:prstGeom prst="rect">
                       <a:avLst/>
@@ -1059,7 +1078,6 @@
         <w:pStyle w:val="NormalWeb"/>
       </w:pPr>
       <w:r>
-        <w:lastRenderedPageBreak/>
         <w:t xml:space="preserve">I now had a structured dataset in place; the next step was to transform individual directory entries into a network that could be analyzed over time. </w:t>
       </w:r>
     </w:p>
@@ -1098,21 +1116,43 @@
       <w:r>
         <w:rPr>
           <w:rFonts w:ascii="Times New Roman" w:hAnsi="Times New Roman" w:cs="Times New Roman"/>
+        </w:rPr>
+        <w:t xml:space="preserve">Allow us to continue with our example entry from Figure 2, Miss Anne Toy. </w:t>
+      </w:r>
+      <w:r>
+        <w:rPr>
+          <w:rFonts w:ascii="Times New Roman" w:hAnsi="Times New Roman" w:cs="Times New Roman"/>
+          <w:b/>
+          <w:bCs/>
+        </w:rPr>
+        <w:t>Miss Anne Toy is not a node</w:t>
+      </w:r>
+      <w:r>
+        <w:rPr>
+          <w:rFonts w:ascii="Times New Roman" w:hAnsi="Times New Roman" w:cs="Times New Roman"/>
+        </w:rPr>
+        <w:t xml:space="preserve">, rather a connecting line between the two organizations she belongs to. Ideally, I’d make each person a node, but it would be impossible to plot in an organized manor. </w:t>
+      </w:r>
+    </w:p>
+    <w:p>
+      <w:pPr>
+        <w:spacing w:line="276" w:lineRule="auto"/>
+        <w:jc w:val="center"/>
+        <w:rPr>
+          <w:rFonts w:ascii="Times New Roman" w:hAnsi="Times New Roman" w:cs="Times New Roman"/>
+        </w:rPr>
+      </w:pPr>
+      <w:r>
+        <w:rPr>
+          <w:rFonts w:ascii="Times New Roman" w:hAnsi="Times New Roman" w:cs="Times New Roman"/>
           <w:noProof/>
         </w:rPr>
+        <w:lastRenderedPageBreak/>
         <w:drawing>
-          <wp:anchor distT="0" distB="0" distL="114300" distR="114300" simplePos="0" relativeHeight="251658240" behindDoc="0" locked="0" layoutInCell="1" allowOverlap="1" wp14:anchorId="69F18016" wp14:editId="235D931D">
-            <wp:simplePos x="0" y="0"/>
-            <wp:positionH relativeFrom="column">
-              <wp:posOffset>-174625</wp:posOffset>
-            </wp:positionH>
-            <wp:positionV relativeFrom="paragraph">
-              <wp:posOffset>702945</wp:posOffset>
-            </wp:positionV>
-            <wp:extent cx="6284595" cy="4189095"/>
-            <wp:effectExtent l="0" t="0" r="1905" b="1905"/>
-            <wp:wrapTopAndBottom/>
-            <wp:docPr id="157097126" name="Picture 8"/>
+          <wp:inline distT="0" distB="0" distL="0" distR="0" wp14:anchorId="2E708FD9" wp14:editId="2E1C8F7B">
+            <wp:extent cx="5943600" cy="5813425"/>
+            <wp:effectExtent l="0" t="0" r="0" b="3175"/>
+            <wp:docPr id="1350918748" name="Picture 2"/>
             <wp:cNvGraphicFramePr>
               <a:graphicFrameLocks xmlns:a="http://schemas.openxmlformats.org/drawingml/2006/main" noChangeAspect="1"/>
             </wp:cNvGraphicFramePr>
@@ -1120,11 +1160,11 @@
               <a:graphicData uri="http://schemas.openxmlformats.org/drawingml/2006/picture">
                 <pic:pic xmlns:pic="http://schemas.openxmlformats.org/drawingml/2006/picture">
                   <pic:nvPicPr>
-                    <pic:cNvPr id="157097126" name="Picture 157097126"/>
+                    <pic:cNvPr id="1350918748" name="Picture 1350918748"/>
                     <pic:cNvPicPr/>
                   </pic:nvPicPr>
                   <pic:blipFill>
-                    <a:blip r:embed="rId9" cstate="print">
+                    <a:blip r:embed="rId9">
                       <a:extLst>
                         <a:ext uri="{28A0092B-C50C-407E-A947-70E740481C1C}">
                           <a14:useLocalDpi xmlns:a14="http://schemas.microsoft.com/office/drawing/2010/main" val="0"/>
@@ -1138,7 +1178,7 @@
                   <pic:spPr>
                     <a:xfrm>
                       <a:off x="0" y="0"/>
-                      <a:ext cx="6284595" cy="4189095"/>
+                      <a:ext cx="5943600" cy="5813425"/>
                     </a:xfrm>
                     <a:prstGeom prst="rect">
                       <a:avLst/>
@@ -1147,44 +1187,9 @@
                 </pic:pic>
               </a:graphicData>
             </a:graphic>
-            <wp14:sizeRelH relativeFrom="page">
-              <wp14:pctWidth>0</wp14:pctWidth>
-            </wp14:sizeRelH>
-            <wp14:sizeRelV relativeFrom="page">
-              <wp14:pctHeight>0</wp14:pctHeight>
-            </wp14:sizeRelV>
-          </wp:anchor>
+          </wp:inline>
         </w:drawing>
       </w:r>
-      <w:r>
-        <w:rPr>
-          <w:rFonts w:ascii="Times New Roman" w:hAnsi="Times New Roman" w:cs="Times New Roman"/>
-        </w:rPr>
-        <w:t xml:space="preserve">Allow us to continue with our example entry from Figure 2, Miss Anne Toy. </w:t>
-      </w:r>
-      <w:r>
-        <w:rPr>
-          <w:rFonts w:ascii="Times New Roman" w:hAnsi="Times New Roman" w:cs="Times New Roman"/>
-          <w:b/>
-          <w:bCs/>
-        </w:rPr>
-        <w:t>Miss Anne Toy is not a node</w:t>
-      </w:r>
-      <w:r>
-        <w:rPr>
-          <w:rFonts w:ascii="Times New Roman" w:hAnsi="Times New Roman" w:cs="Times New Roman"/>
-        </w:rPr>
-        <w:t xml:space="preserve">, rather a connecting line between the two organizations she belongs to. Ideally, I’d make each person a node, but it would be impossible to plot in an organized manor. </w:t>
-      </w:r>
-    </w:p>
-    <w:p>
-      <w:pPr>
-        <w:spacing w:line="276" w:lineRule="auto"/>
-        <w:jc w:val="center"/>
-        <w:rPr>
-          <w:rFonts w:ascii="Times New Roman" w:hAnsi="Times New Roman" w:cs="Times New Roman"/>
-        </w:rPr>
-      </w:pPr>
     </w:p>
     <w:p>
       <w:pPr>
@@ -1260,16 +1265,7 @@
           <w:kern w:val="0"/>
           <w14:ligatures w14:val="none"/>
         </w:rPr>
-        <w:t xml:space="preserve">The results of this project reveal information from the exact clubs/societies that are the most prevalent to the overall social landscape of these various periods of time. For brevity reasons, I’d </w:t>
-      </w:r>
-      <w:r>
-        <w:rPr>
-          <w:rFonts w:ascii="Times New Roman" w:eastAsia="Times New Roman" w:hAnsi="Times New Roman" w:cs="Times New Roman"/>
-          <w:kern w:val="0"/>
-          <w14:ligatures w14:val="none"/>
-        </w:rPr>
-        <w:lastRenderedPageBreak/>
-        <w:t xml:space="preserve">like to focus on the latter. So, while Baltimore’s overall population is declining, the elite network appears to </w:t>
+        <w:t xml:space="preserve">The results of this project reveal information from the exact clubs/societies that are the most prevalent to the overall social landscape of these various periods of time. For brevity reasons, I’d like to focus on the latter. So, while Baltimore’s overall population is declining, the elite network appears to </w:t>
       </w:r>
       <w:r>
         <w:rPr>
@@ -1300,6 +1296,7 @@
           <w:kern w:val="0"/>
           <w14:ligatures w14:val="none"/>
         </w:rPr>
+        <w:lastRenderedPageBreak/>
         <w:t xml:space="preserve">The two key statistics to pay attention to here are </w:t>
       </w:r>
       <w:r>
@@ -1368,7 +1365,7 @@
           <w:kern w:val="0"/>
         </w:rPr>
         <w:drawing>
-          <wp:inline distT="0" distB="0" distL="0" distR="0" wp14:anchorId="04A54450" wp14:editId="017D9C20">
+          <wp:inline distT="0" distB="0" distL="0" distR="0" wp14:anchorId="04A54450" wp14:editId="14A07BB1">
             <wp:extent cx="5943600" cy="3437890"/>
             <wp:effectExtent l="0" t="0" r="0" b="3810"/>
             <wp:docPr id="717674590" name="Picture 11"/>
@@ -1506,7 +1503,7 @@
           <w:noProof/>
         </w:rPr>
         <w:drawing>
-          <wp:inline distT="0" distB="0" distL="0" distR="0" wp14:anchorId="61BAC7C7" wp14:editId="01B114F5">
+          <wp:inline distT="0" distB="0" distL="0" distR="0" wp14:anchorId="61BAC7C7" wp14:editId="18B937DB">
             <wp:extent cx="5781675" cy="3344231"/>
             <wp:effectExtent l="0" t="0" r="0" b="0"/>
             <wp:docPr id="1734982112" name="Picture 12"/>

</xml_diff>